<commit_message>
Working on Python 4 GENAI=NO
</commit_message>
<xml_diff>
--- a/Lectures/Notes.docx
+++ b/Lectures/Notes.docx
@@ -19,7 +19,15 @@
     </w:p>
     <w:p>
       <w:r>
-        <w:t>Style Guide -&gt; We follow snake_case in Python</w:t>
+        <w:t xml:space="preserve">Style Guide -&gt; We follow </w:t>
+      </w:r>
+      <w:proofErr w:type="spellStart"/>
+      <w:r>
+        <w:t>snake_case</w:t>
+      </w:r>
+      <w:proofErr w:type="spellEnd"/>
+      <w:r>
+        <w:t xml:space="preserve"> in Python</w:t>
       </w:r>
     </w:p>
     <w:p>
@@ -32,7 +40,87 @@
     </w:p>
     <w:p>
       <w:r>
-        <w:t>Operator Precedance: [()],  [**],  [*, / ,%],  [+, -],  [==, !=, &gt;, &gt;=, &lt;, &lt;=],  [not],  [and],  [or]  -- Same goes left to right</w:t>
+        <w:t xml:space="preserve">Operator </w:t>
+      </w:r>
+      <w:proofErr w:type="spellStart"/>
+      <w:r>
+        <w:t>Precedance</w:t>
+      </w:r>
+      <w:proofErr w:type="spellEnd"/>
+      <w:r>
+        <w:t>: [()</w:t>
+      </w:r>
+      <w:proofErr w:type="gramStart"/>
+      <w:r>
+        <w:t>],  [</w:t>
+      </w:r>
+      <w:proofErr w:type="gramEnd"/>
+      <w:r>
+        <w:t>**</w:t>
+      </w:r>
+      <w:proofErr w:type="gramStart"/>
+      <w:r>
+        <w:t>],  [</w:t>
+      </w:r>
+      <w:proofErr w:type="gramEnd"/>
+      <w:r>
+        <w:t xml:space="preserve">*, </w:t>
+      </w:r>
+      <w:proofErr w:type="gramStart"/>
+      <w:r>
+        <w:t>/ ,</w:t>
+      </w:r>
+      <w:proofErr w:type="gramEnd"/>
+      <w:r>
+        <w:t>%</w:t>
+      </w:r>
+      <w:proofErr w:type="gramStart"/>
+      <w:r>
+        <w:t>],  [</w:t>
+      </w:r>
+      <w:proofErr w:type="gramEnd"/>
+      <w:r>
+        <w:t>+, -</w:t>
+      </w:r>
+      <w:proofErr w:type="gramStart"/>
+      <w:r>
+        <w:t>],  [</w:t>
+      </w:r>
+      <w:proofErr w:type="gramEnd"/>
+      <w:r>
+        <w:t>==</w:t>
+      </w:r>
+      <w:proofErr w:type="gramStart"/>
+      <w:r>
+        <w:t>, !</w:t>
+      </w:r>
+      <w:proofErr w:type="gramEnd"/>
+      <w:r>
+        <w:t>=, &gt;, &gt;=, &lt;, &lt;=</w:t>
+      </w:r>
+      <w:proofErr w:type="gramStart"/>
+      <w:r>
+        <w:t>],  [</w:t>
+      </w:r>
+      <w:proofErr w:type="gramEnd"/>
+      <w:r>
+        <w:t>not</w:t>
+      </w:r>
+      <w:proofErr w:type="gramStart"/>
+      <w:r>
+        <w:t>],  [</w:t>
+      </w:r>
+      <w:proofErr w:type="gramEnd"/>
+      <w:r>
+        <w:t>and</w:t>
+      </w:r>
+      <w:proofErr w:type="gramStart"/>
+      <w:r>
+        <w:t>],  [or]  --</w:t>
+      </w:r>
+      <w:proofErr w:type="gramEnd"/>
+      <w:r>
+        <w:t xml:space="preserve"> Same goes left to right</w:t>
       </w:r>
     </w:p>
     <w:p>
@@ -42,7 +130,15 @@
     </w:p>
     <w:p>
       <w:r>
-        <w:t>Conditional Statements: if, elif, else</w:t>
+        <w:t xml:space="preserve">Conditional Statements: if, </w:t>
+      </w:r>
+      <w:proofErr w:type="spellStart"/>
+      <w:r>
+        <w:t>elif</w:t>
+      </w:r>
+      <w:proofErr w:type="spellEnd"/>
+      <w:r>
+        <w:t>, else</w:t>
       </w:r>
       <w:r>
         <w:t>, Match Case</w:t>
@@ -55,48 +151,370 @@
     </w:p>
     <w:p>
       <w:r>
-        <w:t>Functions: built-int (print(), input(), type(), range()), user defined</w:t>
+        <w:t>Functions: built-int (</w:t>
+      </w:r>
+      <w:proofErr w:type="gramStart"/>
+      <w:r>
+        <w:t>print(</w:t>
+      </w:r>
+      <w:proofErr w:type="gramEnd"/>
+      <w:r>
+        <w:t xml:space="preserve">), </w:t>
+      </w:r>
+      <w:proofErr w:type="gramStart"/>
+      <w:r>
+        <w:t>input(</w:t>
+      </w:r>
+      <w:proofErr w:type="gramEnd"/>
+      <w:r>
+        <w:t xml:space="preserve">), </w:t>
+      </w:r>
+      <w:proofErr w:type="gramStart"/>
+      <w:r>
+        <w:t>type(</w:t>
+      </w:r>
+      <w:proofErr w:type="gramEnd"/>
+      <w:r>
+        <w:t xml:space="preserve">), </w:t>
+      </w:r>
+      <w:proofErr w:type="gramStart"/>
+      <w:r>
+        <w:t>range(</w:t>
+      </w:r>
+      <w:proofErr w:type="gramEnd"/>
+      <w:r>
+        <w:t>)), user defined</w:t>
       </w:r>
     </w:p>
     <w:p>
       <w:r>
-        <w:t>Lambda function(used in High Order Functions): lambda a,b,c: a+b+c</w:t>
-      </w:r>
+        <w:t xml:space="preserve">Lambda </w:t>
+      </w:r>
+      <w:proofErr w:type="gramStart"/>
+      <w:r>
+        <w:t>function(</w:t>
+      </w:r>
+      <w:proofErr w:type="gramEnd"/>
+      <w:r>
+        <w:t xml:space="preserve">used in High Order Functions): lambda </w:t>
+      </w:r>
+      <w:proofErr w:type="spellStart"/>
+      <w:proofErr w:type="gramStart"/>
+      <w:r>
+        <w:t>a,b</w:t>
+      </w:r>
+      <w:proofErr w:type="gramEnd"/>
+      <w:r>
+        <w:t>,c</w:t>
+      </w:r>
+      <w:proofErr w:type="spellEnd"/>
+      <w:r>
+        <w:t xml:space="preserve">: </w:t>
+      </w:r>
+      <w:proofErr w:type="spellStart"/>
+      <w:r>
+        <w:t>a+b+c</w:t>
+      </w:r>
+      <w:proofErr w:type="spellEnd"/>
     </w:p>
     <w:p>
       <w:r>
         <w:t>Strings: Python strings are immutable, Operations -&gt; Slicing, Formatting</w:t>
       </w:r>
       <w:r>
-        <w:t xml:space="preserve"> (“”.format, f”” &lt;- f-strings)</w:t>
+        <w:t xml:space="preserve"> (“</w:t>
+      </w:r>
+      <w:proofErr w:type="gramStart"/>
+      <w:r>
+        <w:t>”.format</w:t>
+      </w:r>
+      <w:proofErr w:type="gramEnd"/>
+      <w:r>
+        <w:t>, f”” &lt;- f-strings)</w:t>
       </w:r>
     </w:p>
     <w:p>
       <w:r>
-        <w:t>Lists: Python lists are mutable. Methods = l.append(val), l.insert(idx, val), l.sort(), l.reverse()</w:t>
+        <w:t xml:space="preserve">Lists: Python lists are mutable. Methods = </w:t>
+      </w:r>
+      <w:proofErr w:type="spellStart"/>
+      <w:proofErr w:type="gramStart"/>
+      <w:r>
+        <w:t>l.append</w:t>
+      </w:r>
+      <w:proofErr w:type="spellEnd"/>
+      <w:proofErr w:type="gramEnd"/>
+      <w:r>
+        <w:t>(</w:t>
+      </w:r>
+      <w:proofErr w:type="spellStart"/>
+      <w:r>
+        <w:t>val</w:t>
+      </w:r>
+      <w:proofErr w:type="spellEnd"/>
+      <w:r>
+        <w:t xml:space="preserve">), </w:t>
+      </w:r>
+      <w:proofErr w:type="spellStart"/>
+      <w:proofErr w:type="gramStart"/>
+      <w:r>
+        <w:t>l.insert</w:t>
+      </w:r>
+      <w:proofErr w:type="spellEnd"/>
+      <w:proofErr w:type="gramEnd"/>
+      <w:r>
+        <w:t>(</w:t>
+      </w:r>
+      <w:proofErr w:type="spellStart"/>
+      <w:r>
+        <w:t>idx</w:t>
+      </w:r>
+      <w:proofErr w:type="spellEnd"/>
+      <w:r>
+        <w:t xml:space="preserve">, </w:t>
+      </w:r>
+      <w:proofErr w:type="spellStart"/>
+      <w:r>
+        <w:t>val</w:t>
+      </w:r>
+      <w:proofErr w:type="spellEnd"/>
+      <w:r>
+        <w:t xml:space="preserve">), </w:t>
+      </w:r>
+      <w:proofErr w:type="spellStart"/>
+      <w:proofErr w:type="gramStart"/>
+      <w:r>
+        <w:t>l.sort</w:t>
+      </w:r>
+      <w:proofErr w:type="spellEnd"/>
+      <w:proofErr w:type="gramEnd"/>
+      <w:r>
+        <w:t xml:space="preserve">(), </w:t>
+      </w:r>
+      <w:proofErr w:type="spellStart"/>
+      <w:proofErr w:type="gramStart"/>
+      <w:r>
+        <w:t>l.reverse</w:t>
+      </w:r>
+      <w:proofErr w:type="spellEnd"/>
+      <w:proofErr w:type="gramEnd"/>
+      <w:r>
+        <w:t>()</w:t>
       </w:r>
     </w:p>
     <w:p>
       <w:r>
-        <w:t>Tuples: Immutable sequence of values (Imagine as immutable lists), methods = t.index(val), t.count(val)</w:t>
+        <w:t xml:space="preserve">Tuples: Immutable sequence of values (Imagine as immutable lists), methods = </w:t>
+      </w:r>
+      <w:proofErr w:type="spellStart"/>
+      <w:proofErr w:type="gramStart"/>
+      <w:r>
+        <w:t>t.index</w:t>
+      </w:r>
+      <w:proofErr w:type="spellEnd"/>
+      <w:proofErr w:type="gramEnd"/>
+      <w:r>
+        <w:t>(</w:t>
+      </w:r>
+      <w:proofErr w:type="spellStart"/>
+      <w:r>
+        <w:t>val</w:t>
+      </w:r>
+      <w:proofErr w:type="spellEnd"/>
+      <w:r>
+        <w:t xml:space="preserve">), </w:t>
+      </w:r>
+      <w:proofErr w:type="spellStart"/>
+      <w:proofErr w:type="gramStart"/>
+      <w:r>
+        <w:t>t.count</w:t>
+      </w:r>
+      <w:proofErr w:type="spellEnd"/>
+      <w:proofErr w:type="gramEnd"/>
+      <w:r>
+        <w:t>(</w:t>
+      </w:r>
+      <w:proofErr w:type="spellStart"/>
+      <w:r>
+        <w:t>val</w:t>
+      </w:r>
+      <w:proofErr w:type="spellEnd"/>
+      <w:r>
+        <w:t>)</w:t>
       </w:r>
     </w:p>
     <w:p>
       <w:r>
-        <w:t>Dictionary: key:value pairs &amp; Python dictionaries are mutable</w:t>
+        <w:t xml:space="preserve">Dictionary: </w:t>
+      </w:r>
+      <w:proofErr w:type="spellStart"/>
+      <w:r>
+        <w:t>key:value</w:t>
+      </w:r>
+      <w:proofErr w:type="spellEnd"/>
+      <w:r>
+        <w:t xml:space="preserve"> pairs &amp; Python dictionaries are mutable</w:t>
       </w:r>
       <w:r>
         <w:t>.</w:t>
       </w:r>
       <w:r>
-        <w:t xml:space="preserve"> Methods = d.keys(), d.values(), d.items(), d.get(val), d.update(new_item)</w:t>
+        <w:t xml:space="preserve"> Methods = </w:t>
+      </w:r>
+      <w:proofErr w:type="spellStart"/>
+      <w:proofErr w:type="gramStart"/>
+      <w:r>
+        <w:t>d.keys</w:t>
+      </w:r>
+      <w:proofErr w:type="spellEnd"/>
+      <w:proofErr w:type="gramEnd"/>
+      <w:r>
+        <w:t xml:space="preserve">(), </w:t>
+      </w:r>
+      <w:proofErr w:type="spellStart"/>
+      <w:proofErr w:type="gramStart"/>
+      <w:r>
+        <w:t>d.values</w:t>
+      </w:r>
+      <w:proofErr w:type="spellEnd"/>
+      <w:proofErr w:type="gramEnd"/>
+      <w:r>
+        <w:t xml:space="preserve">(), </w:t>
+      </w:r>
+      <w:proofErr w:type="spellStart"/>
+      <w:proofErr w:type="gramStart"/>
+      <w:r>
+        <w:t>d.items</w:t>
+      </w:r>
+      <w:proofErr w:type="spellEnd"/>
+      <w:proofErr w:type="gramEnd"/>
+      <w:r>
+        <w:t xml:space="preserve">(), </w:t>
+      </w:r>
+      <w:proofErr w:type="spellStart"/>
+      <w:r>
+        <w:t>d.get</w:t>
+      </w:r>
+      <w:proofErr w:type="spellEnd"/>
+      <w:r>
+        <w:t>(</w:t>
+      </w:r>
+      <w:proofErr w:type="spellStart"/>
+      <w:r>
+        <w:t>val</w:t>
+      </w:r>
+      <w:proofErr w:type="spellEnd"/>
+      <w:r>
+        <w:t xml:space="preserve">), </w:t>
+      </w:r>
+      <w:proofErr w:type="spellStart"/>
+      <w:proofErr w:type="gramStart"/>
+      <w:r>
+        <w:t>d.update</w:t>
+      </w:r>
+      <w:proofErr w:type="spellEnd"/>
+      <w:proofErr w:type="gramEnd"/>
+      <w:r>
+        <w:t>(</w:t>
+      </w:r>
+      <w:proofErr w:type="spellStart"/>
+      <w:r>
+        <w:t>new_item</w:t>
+      </w:r>
+      <w:proofErr w:type="spellEnd"/>
+      <w:r>
+        <w:t>)</w:t>
       </w:r>
     </w:p>
     <w:p>
       <w:r>
-        <w:t>Sets: Collection of unique elements. Sets can be mutable, but their elements should be immutable (Lists &amp; Dictionaries can’t be elements of a set). Methods = s.add(val), s.remove(val), s.clear(), s.pop(), s.union(set2), s.intersection(set2)</w:t>
+        <w:t xml:space="preserve">Sets: Collection of unique elements. Sets can be mutable, but their elements should be immutable (Lists &amp; Dictionaries can’t be elements of a set). Methods = </w:t>
+      </w:r>
+      <w:proofErr w:type="spellStart"/>
+      <w:r>
+        <w:t>s.add</w:t>
+      </w:r>
+      <w:proofErr w:type="spellEnd"/>
+      <w:r>
+        <w:t>(</w:t>
+      </w:r>
+      <w:proofErr w:type="spellStart"/>
+      <w:r>
+        <w:t>val</w:t>
+      </w:r>
+      <w:proofErr w:type="spellEnd"/>
+      <w:r>
+        <w:t xml:space="preserve">), </w:t>
+      </w:r>
+      <w:proofErr w:type="spellStart"/>
+      <w:proofErr w:type="gramStart"/>
+      <w:r>
+        <w:t>s.remove</w:t>
+      </w:r>
+      <w:proofErr w:type="spellEnd"/>
+      <w:proofErr w:type="gramEnd"/>
+      <w:r>
+        <w:t>(</w:t>
+      </w:r>
+      <w:proofErr w:type="spellStart"/>
+      <w:r>
+        <w:t>val</w:t>
+      </w:r>
+      <w:proofErr w:type="spellEnd"/>
+      <w:r>
+        <w:t xml:space="preserve">), </w:t>
+      </w:r>
+      <w:proofErr w:type="spellStart"/>
+      <w:proofErr w:type="gramStart"/>
+      <w:r>
+        <w:t>s.clear</w:t>
+      </w:r>
+      <w:proofErr w:type="spellEnd"/>
+      <w:proofErr w:type="gramEnd"/>
+      <w:r>
+        <w:t xml:space="preserve">(), </w:t>
+      </w:r>
+      <w:proofErr w:type="spellStart"/>
+      <w:proofErr w:type="gramStart"/>
+      <w:r>
+        <w:t>s.pop</w:t>
+      </w:r>
+      <w:proofErr w:type="spellEnd"/>
+      <w:r>
+        <w:t>(</w:t>
+      </w:r>
+      <w:proofErr w:type="gramEnd"/>
+      <w:r>
+        <w:t xml:space="preserve">), </w:t>
+      </w:r>
+      <w:proofErr w:type="spellStart"/>
+      <w:proofErr w:type="gramStart"/>
+      <w:r>
+        <w:t>s.union</w:t>
+      </w:r>
+      <w:proofErr w:type="spellEnd"/>
+      <w:proofErr w:type="gramEnd"/>
+      <w:r>
+        <w:t xml:space="preserve">(set2), </w:t>
+      </w:r>
+      <w:proofErr w:type="spellStart"/>
+      <w:proofErr w:type="gramStart"/>
+      <w:r>
+        <w:t>s.intersection</w:t>
+      </w:r>
+      <w:proofErr w:type="spellEnd"/>
+      <w:proofErr w:type="gramEnd"/>
+      <w:r>
+        <w:t>(set2)</w:t>
       </w:r>
     </w:p>
+    <w:p/>
+    <w:p>
+      <w:r>
+        <w:t>Object Oriented Programming (OOPs)</w:t>
+      </w:r>
+    </w:p>
+    <w:p/>
     <w:sectPr>
       <w:pgSz w:w="11906" w:h="16838"/>
       <w:pgMar w:top="1440" w:right="1440" w:bottom="1440" w:left="1440" w:header="708" w:footer="708" w:gutter="0"/>

</xml_diff>

<commit_message>
Python 4 continuation GENAI=NO
</commit_message>
<xml_diff>
--- a/Lectures/Notes.docx
+++ b/Lectures/Notes.docx
@@ -19,15 +19,7 @@
     </w:p>
     <w:p>
       <w:r>
-        <w:t xml:space="preserve">Style Guide -&gt; We follow </w:t>
-      </w:r>
-      <w:proofErr w:type="spellStart"/>
-      <w:r>
-        <w:t>snake_case</w:t>
-      </w:r>
-      <w:proofErr w:type="spellEnd"/>
-      <w:r>
-        <w:t xml:space="preserve"> in Python</w:t>
+        <w:t>Style Guide -&gt; We follow snake_case in Python</w:t>
       </w:r>
     </w:p>
     <w:p>
@@ -40,87 +32,7 @@
     </w:p>
     <w:p>
       <w:r>
-        <w:t xml:space="preserve">Operator </w:t>
-      </w:r>
-      <w:proofErr w:type="spellStart"/>
-      <w:r>
-        <w:t>Precedance</w:t>
-      </w:r>
-      <w:proofErr w:type="spellEnd"/>
-      <w:r>
-        <w:t>: [()</w:t>
-      </w:r>
-      <w:proofErr w:type="gramStart"/>
-      <w:r>
-        <w:t>],  [</w:t>
-      </w:r>
-      <w:proofErr w:type="gramEnd"/>
-      <w:r>
-        <w:t>**</w:t>
-      </w:r>
-      <w:proofErr w:type="gramStart"/>
-      <w:r>
-        <w:t>],  [</w:t>
-      </w:r>
-      <w:proofErr w:type="gramEnd"/>
-      <w:r>
-        <w:t xml:space="preserve">*, </w:t>
-      </w:r>
-      <w:proofErr w:type="gramStart"/>
-      <w:r>
-        <w:t>/ ,</w:t>
-      </w:r>
-      <w:proofErr w:type="gramEnd"/>
-      <w:r>
-        <w:t>%</w:t>
-      </w:r>
-      <w:proofErr w:type="gramStart"/>
-      <w:r>
-        <w:t>],  [</w:t>
-      </w:r>
-      <w:proofErr w:type="gramEnd"/>
-      <w:r>
-        <w:t>+, -</w:t>
-      </w:r>
-      <w:proofErr w:type="gramStart"/>
-      <w:r>
-        <w:t>],  [</w:t>
-      </w:r>
-      <w:proofErr w:type="gramEnd"/>
-      <w:r>
-        <w:t>==</w:t>
-      </w:r>
-      <w:proofErr w:type="gramStart"/>
-      <w:r>
-        <w:t>, !</w:t>
-      </w:r>
-      <w:proofErr w:type="gramEnd"/>
-      <w:r>
-        <w:t>=, &gt;, &gt;=, &lt;, &lt;=</w:t>
-      </w:r>
-      <w:proofErr w:type="gramStart"/>
-      <w:r>
-        <w:t>],  [</w:t>
-      </w:r>
-      <w:proofErr w:type="gramEnd"/>
-      <w:r>
-        <w:t>not</w:t>
-      </w:r>
-      <w:proofErr w:type="gramStart"/>
-      <w:r>
-        <w:t>],  [</w:t>
-      </w:r>
-      <w:proofErr w:type="gramEnd"/>
-      <w:r>
-        <w:t>and</w:t>
-      </w:r>
-      <w:proofErr w:type="gramStart"/>
-      <w:r>
-        <w:t>],  [or]  --</w:t>
-      </w:r>
-      <w:proofErr w:type="gramEnd"/>
-      <w:r>
-        <w:t xml:space="preserve"> Same goes left to right</w:t>
+        <w:t>Operator Precedance: [()],  [**],  [*, / ,%],  [+, -],  [==, !=, &gt;, &gt;=, &lt;, &lt;=],  [not],  [and],  [or]  -- Same goes left to right</w:t>
       </w:r>
     </w:p>
     <w:p>
@@ -130,15 +42,7 @@
     </w:p>
     <w:p>
       <w:r>
-        <w:t xml:space="preserve">Conditional Statements: if, </w:t>
-      </w:r>
-      <w:proofErr w:type="spellStart"/>
-      <w:r>
-        <w:t>elif</w:t>
-      </w:r>
-      <w:proofErr w:type="spellEnd"/>
-      <w:r>
-        <w:t>, else</w:t>
+        <w:t>Conditional Statements: if, elif, else</w:t>
       </w:r>
       <w:r>
         <w:t>, Match Case</w:t>
@@ -151,361 +55,46 @@
     </w:p>
     <w:p>
       <w:r>
-        <w:t>Functions: built-int (</w:t>
-      </w:r>
-      <w:proofErr w:type="gramStart"/>
-      <w:r>
-        <w:t>print(</w:t>
-      </w:r>
-      <w:proofErr w:type="gramEnd"/>
-      <w:r>
-        <w:t xml:space="preserve">), </w:t>
-      </w:r>
-      <w:proofErr w:type="gramStart"/>
-      <w:r>
-        <w:t>input(</w:t>
-      </w:r>
-      <w:proofErr w:type="gramEnd"/>
-      <w:r>
-        <w:t xml:space="preserve">), </w:t>
-      </w:r>
-      <w:proofErr w:type="gramStart"/>
-      <w:r>
-        <w:t>type(</w:t>
-      </w:r>
-      <w:proofErr w:type="gramEnd"/>
-      <w:r>
-        <w:t xml:space="preserve">), </w:t>
-      </w:r>
-      <w:proofErr w:type="gramStart"/>
-      <w:r>
-        <w:t>range(</w:t>
-      </w:r>
-      <w:proofErr w:type="gramEnd"/>
-      <w:r>
-        <w:t>)), user defined</w:t>
-      </w:r>
-    </w:p>
-    <w:p>
-      <w:r>
-        <w:t xml:space="preserve">Lambda </w:t>
-      </w:r>
-      <w:proofErr w:type="gramStart"/>
-      <w:r>
-        <w:t>function(</w:t>
-      </w:r>
-      <w:proofErr w:type="gramEnd"/>
-      <w:r>
-        <w:t xml:space="preserve">used in High Order Functions): lambda </w:t>
-      </w:r>
-      <w:proofErr w:type="spellStart"/>
-      <w:proofErr w:type="gramStart"/>
-      <w:r>
-        <w:t>a,b</w:t>
-      </w:r>
-      <w:proofErr w:type="gramEnd"/>
-      <w:r>
-        <w:t>,c</w:t>
-      </w:r>
-      <w:proofErr w:type="spellEnd"/>
-      <w:r>
-        <w:t xml:space="preserve">: </w:t>
-      </w:r>
-      <w:proofErr w:type="spellStart"/>
-      <w:r>
-        <w:t>a+b+c</w:t>
-      </w:r>
-      <w:proofErr w:type="spellEnd"/>
+        <w:t>Functions: built-int (print(), input(), type(), range()), user defined</w:t>
+      </w:r>
+    </w:p>
+    <w:p>
+      <w:r>
+        <w:t>Lambda function(used in High Order Functions): lambda a,b,c: a+b+c</w:t>
+      </w:r>
     </w:p>
     <w:p>
       <w:r>
         <w:t>Strings: Python strings are immutable, Operations -&gt; Slicing, Formatting</w:t>
       </w:r>
       <w:r>
-        <w:t xml:space="preserve"> (“</w:t>
-      </w:r>
-      <w:proofErr w:type="gramStart"/>
-      <w:r>
-        <w:t>”.format</w:t>
-      </w:r>
-      <w:proofErr w:type="gramEnd"/>
-      <w:r>
-        <w:t>, f”” &lt;- f-strings)</w:t>
-      </w:r>
-    </w:p>
-    <w:p>
-      <w:r>
-        <w:t xml:space="preserve">Lists: Python lists are mutable. Methods = </w:t>
-      </w:r>
-      <w:proofErr w:type="spellStart"/>
-      <w:proofErr w:type="gramStart"/>
-      <w:r>
-        <w:t>l.append</w:t>
-      </w:r>
-      <w:proofErr w:type="spellEnd"/>
-      <w:proofErr w:type="gramEnd"/>
-      <w:r>
-        <w:t>(</w:t>
-      </w:r>
-      <w:proofErr w:type="spellStart"/>
-      <w:r>
-        <w:t>val</w:t>
-      </w:r>
-      <w:proofErr w:type="spellEnd"/>
-      <w:r>
-        <w:t xml:space="preserve">), </w:t>
-      </w:r>
-      <w:proofErr w:type="spellStart"/>
-      <w:proofErr w:type="gramStart"/>
-      <w:r>
-        <w:t>l.insert</w:t>
-      </w:r>
-      <w:proofErr w:type="spellEnd"/>
-      <w:proofErr w:type="gramEnd"/>
-      <w:r>
-        <w:t>(</w:t>
-      </w:r>
-      <w:proofErr w:type="spellStart"/>
-      <w:r>
-        <w:t>idx</w:t>
-      </w:r>
-      <w:proofErr w:type="spellEnd"/>
-      <w:r>
-        <w:t xml:space="preserve">, </w:t>
-      </w:r>
-      <w:proofErr w:type="spellStart"/>
-      <w:r>
-        <w:t>val</w:t>
-      </w:r>
-      <w:proofErr w:type="spellEnd"/>
-      <w:r>
-        <w:t xml:space="preserve">), </w:t>
-      </w:r>
-      <w:proofErr w:type="spellStart"/>
-      <w:proofErr w:type="gramStart"/>
-      <w:r>
-        <w:t>l.sort</w:t>
-      </w:r>
-      <w:proofErr w:type="spellEnd"/>
-      <w:proofErr w:type="gramEnd"/>
-      <w:r>
-        <w:t xml:space="preserve">(), </w:t>
-      </w:r>
-      <w:proofErr w:type="spellStart"/>
-      <w:proofErr w:type="gramStart"/>
-      <w:r>
-        <w:t>l.reverse</w:t>
-      </w:r>
-      <w:proofErr w:type="spellEnd"/>
-      <w:proofErr w:type="gramEnd"/>
-      <w:r>
-        <w:t>()</w:t>
-      </w:r>
-    </w:p>
-    <w:p>
-      <w:r>
-        <w:t xml:space="preserve">Tuples: Immutable sequence of values (Imagine as immutable lists), methods = </w:t>
-      </w:r>
-      <w:proofErr w:type="spellStart"/>
-      <w:proofErr w:type="gramStart"/>
-      <w:r>
-        <w:t>t.index</w:t>
-      </w:r>
-      <w:proofErr w:type="spellEnd"/>
-      <w:proofErr w:type="gramEnd"/>
-      <w:r>
-        <w:t>(</w:t>
-      </w:r>
-      <w:proofErr w:type="spellStart"/>
-      <w:r>
-        <w:t>val</w:t>
-      </w:r>
-      <w:proofErr w:type="spellEnd"/>
-      <w:r>
-        <w:t xml:space="preserve">), </w:t>
-      </w:r>
-      <w:proofErr w:type="spellStart"/>
-      <w:proofErr w:type="gramStart"/>
-      <w:r>
-        <w:t>t.count</w:t>
-      </w:r>
-      <w:proofErr w:type="spellEnd"/>
-      <w:proofErr w:type="gramEnd"/>
-      <w:r>
-        <w:t>(</w:t>
-      </w:r>
-      <w:proofErr w:type="spellStart"/>
-      <w:r>
-        <w:t>val</w:t>
-      </w:r>
-      <w:proofErr w:type="spellEnd"/>
-      <w:r>
-        <w:t>)</w:t>
-      </w:r>
-    </w:p>
-    <w:p>
-      <w:r>
-        <w:t xml:space="preserve">Dictionary: </w:t>
-      </w:r>
-      <w:proofErr w:type="spellStart"/>
-      <w:r>
-        <w:t>key:value</w:t>
-      </w:r>
-      <w:proofErr w:type="spellEnd"/>
-      <w:r>
-        <w:t xml:space="preserve"> pairs &amp; Python dictionaries are mutable</w:t>
+        <w:t xml:space="preserve"> (“”.format, f”” &lt;- f-strings)</w:t>
+      </w:r>
+    </w:p>
+    <w:p>
+      <w:r>
+        <w:t>Lists: Python lists are mutable. Methods = l.append(val), l.insert(idx, val), l.sort(), l.reverse()</w:t>
+      </w:r>
+    </w:p>
+    <w:p>
+      <w:r>
+        <w:t>Tuples: Immutable sequence of values (Imagine as immutable lists), methods = t.index(val), t.count(val)</w:t>
+      </w:r>
+    </w:p>
+    <w:p>
+      <w:r>
+        <w:t>Dictionary: key:value pairs &amp; Python dictionaries are mutable</w:t>
       </w:r>
       <w:r>
         <w:t>.</w:t>
       </w:r>
       <w:r>
-        <w:t xml:space="preserve"> Methods = </w:t>
-      </w:r>
-      <w:proofErr w:type="spellStart"/>
-      <w:proofErr w:type="gramStart"/>
-      <w:r>
-        <w:t>d.keys</w:t>
-      </w:r>
-      <w:proofErr w:type="spellEnd"/>
-      <w:proofErr w:type="gramEnd"/>
-      <w:r>
-        <w:t xml:space="preserve">(), </w:t>
-      </w:r>
-      <w:proofErr w:type="spellStart"/>
-      <w:proofErr w:type="gramStart"/>
-      <w:r>
-        <w:t>d.values</w:t>
-      </w:r>
-      <w:proofErr w:type="spellEnd"/>
-      <w:proofErr w:type="gramEnd"/>
-      <w:r>
-        <w:t xml:space="preserve">(), </w:t>
-      </w:r>
-      <w:proofErr w:type="spellStart"/>
-      <w:proofErr w:type="gramStart"/>
-      <w:r>
-        <w:t>d.items</w:t>
-      </w:r>
-      <w:proofErr w:type="spellEnd"/>
-      <w:proofErr w:type="gramEnd"/>
-      <w:r>
-        <w:t xml:space="preserve">(), </w:t>
-      </w:r>
-      <w:proofErr w:type="spellStart"/>
-      <w:r>
-        <w:t>d.get</w:t>
-      </w:r>
-      <w:proofErr w:type="spellEnd"/>
-      <w:r>
-        <w:t>(</w:t>
-      </w:r>
-      <w:proofErr w:type="spellStart"/>
-      <w:r>
-        <w:t>val</w:t>
-      </w:r>
-      <w:proofErr w:type="spellEnd"/>
-      <w:r>
-        <w:t xml:space="preserve">), </w:t>
-      </w:r>
-      <w:proofErr w:type="spellStart"/>
-      <w:proofErr w:type="gramStart"/>
-      <w:r>
-        <w:t>d.update</w:t>
-      </w:r>
-      <w:proofErr w:type="spellEnd"/>
-      <w:proofErr w:type="gramEnd"/>
-      <w:r>
-        <w:t>(</w:t>
-      </w:r>
-      <w:proofErr w:type="spellStart"/>
-      <w:r>
-        <w:t>new_item</w:t>
-      </w:r>
-      <w:proofErr w:type="spellEnd"/>
-      <w:r>
-        <w:t>)</w:t>
-      </w:r>
-    </w:p>
-    <w:p>
-      <w:r>
-        <w:t xml:space="preserve">Sets: Collection of unique elements. Sets can be mutable, but their elements should be immutable (Lists &amp; Dictionaries can’t be elements of a set). Methods = </w:t>
-      </w:r>
-      <w:proofErr w:type="spellStart"/>
-      <w:r>
-        <w:t>s.add</w:t>
-      </w:r>
-      <w:proofErr w:type="spellEnd"/>
-      <w:r>
-        <w:t>(</w:t>
-      </w:r>
-      <w:proofErr w:type="spellStart"/>
-      <w:r>
-        <w:t>val</w:t>
-      </w:r>
-      <w:proofErr w:type="spellEnd"/>
-      <w:r>
-        <w:t xml:space="preserve">), </w:t>
-      </w:r>
-      <w:proofErr w:type="spellStart"/>
-      <w:proofErr w:type="gramStart"/>
-      <w:r>
-        <w:t>s.remove</w:t>
-      </w:r>
-      <w:proofErr w:type="spellEnd"/>
-      <w:proofErr w:type="gramEnd"/>
-      <w:r>
-        <w:t>(</w:t>
-      </w:r>
-      <w:proofErr w:type="spellStart"/>
-      <w:r>
-        <w:t>val</w:t>
-      </w:r>
-      <w:proofErr w:type="spellEnd"/>
-      <w:r>
-        <w:t xml:space="preserve">), </w:t>
-      </w:r>
-      <w:proofErr w:type="spellStart"/>
-      <w:proofErr w:type="gramStart"/>
-      <w:r>
-        <w:t>s.clear</w:t>
-      </w:r>
-      <w:proofErr w:type="spellEnd"/>
-      <w:proofErr w:type="gramEnd"/>
-      <w:r>
-        <w:t xml:space="preserve">(), </w:t>
-      </w:r>
-      <w:proofErr w:type="spellStart"/>
-      <w:proofErr w:type="gramStart"/>
-      <w:r>
-        <w:t>s.pop</w:t>
-      </w:r>
-      <w:proofErr w:type="spellEnd"/>
-      <w:r>
-        <w:t>(</w:t>
-      </w:r>
-      <w:proofErr w:type="gramEnd"/>
-      <w:r>
-        <w:t xml:space="preserve">), </w:t>
-      </w:r>
-      <w:proofErr w:type="spellStart"/>
-      <w:proofErr w:type="gramStart"/>
-      <w:r>
-        <w:t>s.union</w:t>
-      </w:r>
-      <w:proofErr w:type="spellEnd"/>
-      <w:proofErr w:type="gramEnd"/>
-      <w:r>
-        <w:t xml:space="preserve">(set2), </w:t>
-      </w:r>
-      <w:proofErr w:type="spellStart"/>
-      <w:proofErr w:type="gramStart"/>
-      <w:r>
-        <w:t>s.intersection</w:t>
-      </w:r>
-      <w:proofErr w:type="spellEnd"/>
-      <w:proofErr w:type="gramEnd"/>
-      <w:r>
-        <w:t>(set2)</w:t>
+        <w:t xml:space="preserve"> Methods = d.keys(), d.values(), d.items(), d.get(val), d.update(new_item)</w:t>
+      </w:r>
+    </w:p>
+    <w:p>
+      <w:r>
+        <w:t>Sets: Collection of unique elements. Sets can be mutable, but their elements should be immutable (Lists &amp; Dictionaries can’t be elements of a set). Methods = s.add(val), s.remove(val), s.clear(), s.pop(), s.union(set2), s.intersection(set2)</w:t>
       </w:r>
     </w:p>
     <w:p/>
@@ -514,7 +103,21 @@
         <w:t>Object Oriented Programming (OOPs)</w:t>
       </w:r>
     </w:p>
-    <w:p/>
+    <w:p>
+      <w:r>
+        <w:t>Properties (attributes), Behaviours (methods)</w:t>
+      </w:r>
+    </w:p>
+    <w:p>
+      <w:r>
+        <w:t>Constructor – init() Method: Default &amp; Parameterised. We can’t create multiple constructors in Python; otherwise, it takes the last one if all are the same, and if different, then it gives errors</w:t>
+      </w:r>
+    </w:p>
+    <w:p>
+      <w:r>
+        <w:t>Attributes: Class (belongs to Class) - common &amp; Instance (belongs to Object) - unique</w:t>
+      </w:r>
+    </w:p>
     <w:sectPr>
       <w:pgSz w:w="11906" w:h="16838"/>
       <w:pgMar w:top="1440" w:right="1440" w:bottom="1440" w:left="1440" w:header="708" w:footer="708" w:gutter="0"/>

</xml_diff>

<commit_message>
Python Fundamentals Part 4
</commit_message>
<xml_diff>
--- a/Lectures/Notes.docx
+++ b/Lectures/Notes.docx
@@ -19,7 +19,15 @@
     </w:p>
     <w:p>
       <w:r>
-        <w:t>Style Guide -&gt; We follow snake_case in Python</w:t>
+        <w:t xml:space="preserve">Style Guide -&gt; We follow </w:t>
+      </w:r>
+      <w:proofErr w:type="spellStart"/>
+      <w:r>
+        <w:t>snake_case</w:t>
+      </w:r>
+      <w:proofErr w:type="spellEnd"/>
+      <w:r>
+        <w:t xml:space="preserve"> in Python</w:t>
       </w:r>
     </w:p>
     <w:p>
@@ -32,7 +40,87 @@
     </w:p>
     <w:p>
       <w:r>
-        <w:t>Operator Precedance: [()],  [**],  [*, / ,%],  [+, -],  [==, !=, &gt;, &gt;=, &lt;, &lt;=],  [not],  [and],  [or]  -- Same goes left to right</w:t>
+        <w:t xml:space="preserve">Operator </w:t>
+      </w:r>
+      <w:proofErr w:type="spellStart"/>
+      <w:r>
+        <w:t>Precedance</w:t>
+      </w:r>
+      <w:proofErr w:type="spellEnd"/>
+      <w:r>
+        <w:t>: [()</w:t>
+      </w:r>
+      <w:proofErr w:type="gramStart"/>
+      <w:r>
+        <w:t>],  [</w:t>
+      </w:r>
+      <w:proofErr w:type="gramEnd"/>
+      <w:r>
+        <w:t>**</w:t>
+      </w:r>
+      <w:proofErr w:type="gramStart"/>
+      <w:r>
+        <w:t>],  [</w:t>
+      </w:r>
+      <w:proofErr w:type="gramEnd"/>
+      <w:r>
+        <w:t xml:space="preserve">*, </w:t>
+      </w:r>
+      <w:proofErr w:type="gramStart"/>
+      <w:r>
+        <w:t>/ ,</w:t>
+      </w:r>
+      <w:proofErr w:type="gramEnd"/>
+      <w:r>
+        <w:t>%</w:t>
+      </w:r>
+      <w:proofErr w:type="gramStart"/>
+      <w:r>
+        <w:t>],  [</w:t>
+      </w:r>
+      <w:proofErr w:type="gramEnd"/>
+      <w:r>
+        <w:t>+, -</w:t>
+      </w:r>
+      <w:proofErr w:type="gramStart"/>
+      <w:r>
+        <w:t>],  [</w:t>
+      </w:r>
+      <w:proofErr w:type="gramEnd"/>
+      <w:r>
+        <w:t>==</w:t>
+      </w:r>
+      <w:proofErr w:type="gramStart"/>
+      <w:r>
+        <w:t>, !</w:t>
+      </w:r>
+      <w:proofErr w:type="gramEnd"/>
+      <w:r>
+        <w:t>=, &gt;, &gt;=, &lt;, &lt;=</w:t>
+      </w:r>
+      <w:proofErr w:type="gramStart"/>
+      <w:r>
+        <w:t>],  [</w:t>
+      </w:r>
+      <w:proofErr w:type="gramEnd"/>
+      <w:r>
+        <w:t>not</w:t>
+      </w:r>
+      <w:proofErr w:type="gramStart"/>
+      <w:r>
+        <w:t>],  [</w:t>
+      </w:r>
+      <w:proofErr w:type="gramEnd"/>
+      <w:r>
+        <w:t>and</w:t>
+      </w:r>
+      <w:proofErr w:type="gramStart"/>
+      <w:r>
+        <w:t>],  [or]  --</w:t>
+      </w:r>
+      <w:proofErr w:type="gramEnd"/>
+      <w:r>
+        <w:t xml:space="preserve"> Same goes left to right</w:t>
       </w:r>
     </w:p>
     <w:p>
@@ -42,7 +130,15 @@
     </w:p>
     <w:p>
       <w:r>
-        <w:t>Conditional Statements: if, elif, else</w:t>
+        <w:t xml:space="preserve">Conditional Statements: if, </w:t>
+      </w:r>
+      <w:proofErr w:type="spellStart"/>
+      <w:r>
+        <w:t>elif</w:t>
+      </w:r>
+      <w:proofErr w:type="spellEnd"/>
+      <w:r>
+        <w:t>, else</w:t>
       </w:r>
       <w:r>
         <w:t>, Match Case</w:t>
@@ -55,46 +151,361 @@
     </w:p>
     <w:p>
       <w:r>
-        <w:t>Functions: built-int (print(), input(), type(), range()), user defined</w:t>
-      </w:r>
-    </w:p>
-    <w:p>
-      <w:r>
-        <w:t>Lambda function(used in High Order Functions): lambda a,b,c: a+b+c</w:t>
-      </w:r>
+        <w:t>Functions: built-int (</w:t>
+      </w:r>
+      <w:proofErr w:type="gramStart"/>
+      <w:r>
+        <w:t>print(</w:t>
+      </w:r>
+      <w:proofErr w:type="gramEnd"/>
+      <w:r>
+        <w:t xml:space="preserve">), </w:t>
+      </w:r>
+      <w:proofErr w:type="gramStart"/>
+      <w:r>
+        <w:t>input(</w:t>
+      </w:r>
+      <w:proofErr w:type="gramEnd"/>
+      <w:r>
+        <w:t xml:space="preserve">), </w:t>
+      </w:r>
+      <w:proofErr w:type="gramStart"/>
+      <w:r>
+        <w:t>type(</w:t>
+      </w:r>
+      <w:proofErr w:type="gramEnd"/>
+      <w:r>
+        <w:t xml:space="preserve">), </w:t>
+      </w:r>
+      <w:proofErr w:type="gramStart"/>
+      <w:r>
+        <w:t>range(</w:t>
+      </w:r>
+      <w:proofErr w:type="gramEnd"/>
+      <w:r>
+        <w:t>)), user defined</w:t>
+      </w:r>
+    </w:p>
+    <w:p>
+      <w:r>
+        <w:t xml:space="preserve">Lambda </w:t>
+      </w:r>
+      <w:proofErr w:type="gramStart"/>
+      <w:r>
+        <w:t>function(</w:t>
+      </w:r>
+      <w:proofErr w:type="gramEnd"/>
+      <w:r>
+        <w:t xml:space="preserve">used in High Order Functions): lambda </w:t>
+      </w:r>
+      <w:proofErr w:type="spellStart"/>
+      <w:proofErr w:type="gramStart"/>
+      <w:r>
+        <w:t>a,b</w:t>
+      </w:r>
+      <w:proofErr w:type="gramEnd"/>
+      <w:r>
+        <w:t>,c</w:t>
+      </w:r>
+      <w:proofErr w:type="spellEnd"/>
+      <w:r>
+        <w:t xml:space="preserve">: </w:t>
+      </w:r>
+      <w:proofErr w:type="spellStart"/>
+      <w:r>
+        <w:t>a+b+c</w:t>
+      </w:r>
+      <w:proofErr w:type="spellEnd"/>
     </w:p>
     <w:p>
       <w:r>
         <w:t>Strings: Python strings are immutable, Operations -&gt; Slicing, Formatting</w:t>
       </w:r>
       <w:r>
-        <w:t xml:space="preserve"> (“”.format, f”” &lt;- f-strings)</w:t>
-      </w:r>
-    </w:p>
-    <w:p>
-      <w:r>
-        <w:t>Lists: Python lists are mutable. Methods = l.append(val), l.insert(idx, val), l.sort(), l.reverse()</w:t>
-      </w:r>
-    </w:p>
-    <w:p>
-      <w:r>
-        <w:t>Tuples: Immutable sequence of values (Imagine as immutable lists), methods = t.index(val), t.count(val)</w:t>
-      </w:r>
-    </w:p>
-    <w:p>
-      <w:r>
-        <w:t>Dictionary: key:value pairs &amp; Python dictionaries are mutable</w:t>
+        <w:t xml:space="preserve"> (“</w:t>
+      </w:r>
+      <w:proofErr w:type="gramStart"/>
+      <w:r>
+        <w:t>”.format</w:t>
+      </w:r>
+      <w:proofErr w:type="gramEnd"/>
+      <w:r>
+        <w:t>, f”” &lt;- f-strings)</w:t>
+      </w:r>
+    </w:p>
+    <w:p>
+      <w:r>
+        <w:t xml:space="preserve">Lists: Python lists are mutable. Methods = </w:t>
+      </w:r>
+      <w:proofErr w:type="spellStart"/>
+      <w:proofErr w:type="gramStart"/>
+      <w:r>
+        <w:t>l.append</w:t>
+      </w:r>
+      <w:proofErr w:type="spellEnd"/>
+      <w:proofErr w:type="gramEnd"/>
+      <w:r>
+        <w:t>(</w:t>
+      </w:r>
+      <w:proofErr w:type="spellStart"/>
+      <w:r>
+        <w:t>val</w:t>
+      </w:r>
+      <w:proofErr w:type="spellEnd"/>
+      <w:r>
+        <w:t xml:space="preserve">), </w:t>
+      </w:r>
+      <w:proofErr w:type="spellStart"/>
+      <w:proofErr w:type="gramStart"/>
+      <w:r>
+        <w:t>l.insert</w:t>
+      </w:r>
+      <w:proofErr w:type="spellEnd"/>
+      <w:proofErr w:type="gramEnd"/>
+      <w:r>
+        <w:t>(</w:t>
+      </w:r>
+      <w:proofErr w:type="spellStart"/>
+      <w:r>
+        <w:t>idx</w:t>
+      </w:r>
+      <w:proofErr w:type="spellEnd"/>
+      <w:r>
+        <w:t xml:space="preserve">, </w:t>
+      </w:r>
+      <w:proofErr w:type="spellStart"/>
+      <w:r>
+        <w:t>val</w:t>
+      </w:r>
+      <w:proofErr w:type="spellEnd"/>
+      <w:r>
+        <w:t xml:space="preserve">), </w:t>
+      </w:r>
+      <w:proofErr w:type="spellStart"/>
+      <w:proofErr w:type="gramStart"/>
+      <w:r>
+        <w:t>l.sort</w:t>
+      </w:r>
+      <w:proofErr w:type="spellEnd"/>
+      <w:proofErr w:type="gramEnd"/>
+      <w:r>
+        <w:t xml:space="preserve">(), </w:t>
+      </w:r>
+      <w:proofErr w:type="spellStart"/>
+      <w:proofErr w:type="gramStart"/>
+      <w:r>
+        <w:t>l.reverse</w:t>
+      </w:r>
+      <w:proofErr w:type="spellEnd"/>
+      <w:proofErr w:type="gramEnd"/>
+      <w:r>
+        <w:t>()</w:t>
+      </w:r>
+    </w:p>
+    <w:p>
+      <w:r>
+        <w:t xml:space="preserve">Tuples: Immutable sequence of values (Imagine as immutable lists), methods = </w:t>
+      </w:r>
+      <w:proofErr w:type="spellStart"/>
+      <w:proofErr w:type="gramStart"/>
+      <w:r>
+        <w:t>t.index</w:t>
+      </w:r>
+      <w:proofErr w:type="spellEnd"/>
+      <w:proofErr w:type="gramEnd"/>
+      <w:r>
+        <w:t>(</w:t>
+      </w:r>
+      <w:proofErr w:type="spellStart"/>
+      <w:r>
+        <w:t>val</w:t>
+      </w:r>
+      <w:proofErr w:type="spellEnd"/>
+      <w:r>
+        <w:t xml:space="preserve">), </w:t>
+      </w:r>
+      <w:proofErr w:type="spellStart"/>
+      <w:proofErr w:type="gramStart"/>
+      <w:r>
+        <w:t>t.count</w:t>
+      </w:r>
+      <w:proofErr w:type="spellEnd"/>
+      <w:proofErr w:type="gramEnd"/>
+      <w:r>
+        <w:t>(</w:t>
+      </w:r>
+      <w:proofErr w:type="spellStart"/>
+      <w:r>
+        <w:t>val</w:t>
+      </w:r>
+      <w:proofErr w:type="spellEnd"/>
+      <w:r>
+        <w:t>)</w:t>
+      </w:r>
+    </w:p>
+    <w:p>
+      <w:r>
+        <w:t xml:space="preserve">Dictionary: </w:t>
+      </w:r>
+      <w:proofErr w:type="spellStart"/>
+      <w:r>
+        <w:t>key:value</w:t>
+      </w:r>
+      <w:proofErr w:type="spellEnd"/>
+      <w:r>
+        <w:t xml:space="preserve"> pairs &amp; Python dictionaries are mutable</w:t>
       </w:r>
       <w:r>
         <w:t>.</w:t>
       </w:r>
       <w:r>
-        <w:t xml:space="preserve"> Methods = d.keys(), d.values(), d.items(), d.get(val), d.update(new_item)</w:t>
-      </w:r>
-    </w:p>
-    <w:p>
-      <w:r>
-        <w:t>Sets: Collection of unique elements. Sets can be mutable, but their elements should be immutable (Lists &amp; Dictionaries can’t be elements of a set). Methods = s.add(val), s.remove(val), s.clear(), s.pop(), s.union(set2), s.intersection(set2)</w:t>
+        <w:t xml:space="preserve"> Methods = </w:t>
+      </w:r>
+      <w:proofErr w:type="spellStart"/>
+      <w:proofErr w:type="gramStart"/>
+      <w:r>
+        <w:t>d.keys</w:t>
+      </w:r>
+      <w:proofErr w:type="spellEnd"/>
+      <w:proofErr w:type="gramEnd"/>
+      <w:r>
+        <w:t xml:space="preserve">(), </w:t>
+      </w:r>
+      <w:proofErr w:type="spellStart"/>
+      <w:proofErr w:type="gramStart"/>
+      <w:r>
+        <w:t>d.values</w:t>
+      </w:r>
+      <w:proofErr w:type="spellEnd"/>
+      <w:proofErr w:type="gramEnd"/>
+      <w:r>
+        <w:t xml:space="preserve">(), </w:t>
+      </w:r>
+      <w:proofErr w:type="spellStart"/>
+      <w:proofErr w:type="gramStart"/>
+      <w:r>
+        <w:t>d.items</w:t>
+      </w:r>
+      <w:proofErr w:type="spellEnd"/>
+      <w:proofErr w:type="gramEnd"/>
+      <w:r>
+        <w:t xml:space="preserve">(), </w:t>
+      </w:r>
+      <w:proofErr w:type="spellStart"/>
+      <w:r>
+        <w:t>d.get</w:t>
+      </w:r>
+      <w:proofErr w:type="spellEnd"/>
+      <w:r>
+        <w:t>(</w:t>
+      </w:r>
+      <w:proofErr w:type="spellStart"/>
+      <w:r>
+        <w:t>val</w:t>
+      </w:r>
+      <w:proofErr w:type="spellEnd"/>
+      <w:r>
+        <w:t xml:space="preserve">), </w:t>
+      </w:r>
+      <w:proofErr w:type="spellStart"/>
+      <w:proofErr w:type="gramStart"/>
+      <w:r>
+        <w:t>d.update</w:t>
+      </w:r>
+      <w:proofErr w:type="spellEnd"/>
+      <w:proofErr w:type="gramEnd"/>
+      <w:r>
+        <w:t>(</w:t>
+      </w:r>
+      <w:proofErr w:type="spellStart"/>
+      <w:r>
+        <w:t>new_item</w:t>
+      </w:r>
+      <w:proofErr w:type="spellEnd"/>
+      <w:r>
+        <w:t>)</w:t>
+      </w:r>
+    </w:p>
+    <w:p>
+      <w:r>
+        <w:t xml:space="preserve">Sets: Collection of unique elements. Sets can be mutable, but their elements should be immutable (Lists &amp; Dictionaries can’t be elements of a set). Methods = </w:t>
+      </w:r>
+      <w:proofErr w:type="spellStart"/>
+      <w:r>
+        <w:t>s.add</w:t>
+      </w:r>
+      <w:proofErr w:type="spellEnd"/>
+      <w:r>
+        <w:t>(</w:t>
+      </w:r>
+      <w:proofErr w:type="spellStart"/>
+      <w:r>
+        <w:t>val</w:t>
+      </w:r>
+      <w:proofErr w:type="spellEnd"/>
+      <w:r>
+        <w:t xml:space="preserve">), </w:t>
+      </w:r>
+      <w:proofErr w:type="spellStart"/>
+      <w:proofErr w:type="gramStart"/>
+      <w:r>
+        <w:t>s.remove</w:t>
+      </w:r>
+      <w:proofErr w:type="spellEnd"/>
+      <w:proofErr w:type="gramEnd"/>
+      <w:r>
+        <w:t>(</w:t>
+      </w:r>
+      <w:proofErr w:type="spellStart"/>
+      <w:r>
+        <w:t>val</w:t>
+      </w:r>
+      <w:proofErr w:type="spellEnd"/>
+      <w:r>
+        <w:t xml:space="preserve">), </w:t>
+      </w:r>
+      <w:proofErr w:type="spellStart"/>
+      <w:proofErr w:type="gramStart"/>
+      <w:r>
+        <w:t>s.clear</w:t>
+      </w:r>
+      <w:proofErr w:type="spellEnd"/>
+      <w:proofErr w:type="gramEnd"/>
+      <w:r>
+        <w:t xml:space="preserve">(), </w:t>
+      </w:r>
+      <w:proofErr w:type="spellStart"/>
+      <w:proofErr w:type="gramStart"/>
+      <w:r>
+        <w:t>s.pop</w:t>
+      </w:r>
+      <w:proofErr w:type="spellEnd"/>
+      <w:r>
+        <w:t>(</w:t>
+      </w:r>
+      <w:proofErr w:type="gramEnd"/>
+      <w:r>
+        <w:t xml:space="preserve">), </w:t>
+      </w:r>
+      <w:proofErr w:type="spellStart"/>
+      <w:proofErr w:type="gramStart"/>
+      <w:r>
+        <w:t>s.union</w:t>
+      </w:r>
+      <w:proofErr w:type="spellEnd"/>
+      <w:proofErr w:type="gramEnd"/>
+      <w:r>
+        <w:t xml:space="preserve">(set2), </w:t>
+      </w:r>
+      <w:proofErr w:type="spellStart"/>
+      <w:proofErr w:type="gramStart"/>
+      <w:r>
+        <w:t>s.intersection</w:t>
+      </w:r>
+      <w:proofErr w:type="spellEnd"/>
+      <w:proofErr w:type="gramEnd"/>
+      <w:r>
+        <w:t>(set2)</w:t>
       </w:r>
     </w:p>
     <w:p/>
@@ -110,12 +521,50 @@
     </w:p>
     <w:p>
       <w:r>
-        <w:t>Constructor – init() Method: Default &amp; Parameterised. We can’t create multiple constructors in Python; otherwise, it takes the last one if all are the same, and if different, then it gives errors</w:t>
-      </w:r>
-    </w:p>
-    <w:p>
-      <w:r>
-        <w:t>Attributes: Class (belongs to Class) - common &amp; Instance (belongs to Object) - unique</w:t>
+        <w:t xml:space="preserve">Constructor – </w:t>
+      </w:r>
+      <w:proofErr w:type="spellStart"/>
+      <w:proofErr w:type="gramStart"/>
+      <w:r>
+        <w:t>init</w:t>
+      </w:r>
+      <w:proofErr w:type="spellEnd"/>
+      <w:r>
+        <w:t>(</w:t>
+      </w:r>
+      <w:proofErr w:type="gramEnd"/>
+      <w:r>
+        <w:t>) Method: Default &amp; Parameterised. We can’t create multiple constructors in Python; otherwise, it takes the last one if all are the same, and if different, then it gives errors</w:t>
+      </w:r>
+    </w:p>
+    <w:p>
+      <w:r>
+        <w:t xml:space="preserve">Attributes: Class (belongs to Class) - common &amp; Instance (belongs to Object) </w:t>
+      </w:r>
+      <w:r>
+        <w:t>–</w:t>
+      </w:r>
+      <w:r>
+        <w:t xml:space="preserve"> unique</w:t>
+      </w:r>
+    </w:p>
+    <w:p>
+      <w:r>
+        <w:t>Methods: Instance, Class (use decorator [@classmethod] which changes the behaviour of a class and changes it to class method), Static</w:t>
+      </w:r>
+    </w:p>
+    <w:p>
+      <w:r>
+        <w:t>Encapsulation: Wrapping data and functions into a single unit &lt;- Class &amp; also we can do data hiding. Public (accessible anywhere), Protected (accessible in classes and their subclasses), Private (accessible only inside the class) attributes</w:t>
+      </w:r>
+    </w:p>
+    <w:p>
+      <w:r>
+        <w:lastRenderedPageBreak/>
+        <w:t>Inheritance: Reusing attribute &amp; methods from a Parent (Base) class</w:t>
+      </w:r>
+      <w:r>
+        <w:t>. Single Level Inheritance, Multi Level Inheritance, Multiple Inheritance</w:t>
       </w:r>
     </w:p>
     <w:sectPr>

</xml_diff>

<commit_message>
Python Fundamentals Part 5
</commit_message>
<xml_diff>
--- a/Lectures/Notes.docx
+++ b/Lectures/Notes.docx
@@ -19,15 +19,7 @@
     </w:p>
     <w:p>
       <w:r>
-        <w:t xml:space="preserve">Style Guide -&gt; We follow </w:t>
-      </w:r>
-      <w:proofErr w:type="spellStart"/>
-      <w:r>
-        <w:t>snake_case</w:t>
-      </w:r>
-      <w:proofErr w:type="spellEnd"/>
-      <w:r>
-        <w:t xml:space="preserve"> in Python</w:t>
+        <w:t>Style Guide -&gt; We follow snake_case in Python</w:t>
       </w:r>
     </w:p>
     <w:p>
@@ -40,87 +32,7 @@
     </w:p>
     <w:p>
       <w:r>
-        <w:t xml:space="preserve">Operator </w:t>
-      </w:r>
-      <w:proofErr w:type="spellStart"/>
-      <w:r>
-        <w:t>Precedance</w:t>
-      </w:r>
-      <w:proofErr w:type="spellEnd"/>
-      <w:r>
-        <w:t>: [()</w:t>
-      </w:r>
-      <w:proofErr w:type="gramStart"/>
-      <w:r>
-        <w:t>],  [</w:t>
-      </w:r>
-      <w:proofErr w:type="gramEnd"/>
-      <w:r>
-        <w:t>**</w:t>
-      </w:r>
-      <w:proofErr w:type="gramStart"/>
-      <w:r>
-        <w:t>],  [</w:t>
-      </w:r>
-      <w:proofErr w:type="gramEnd"/>
-      <w:r>
-        <w:t xml:space="preserve">*, </w:t>
-      </w:r>
-      <w:proofErr w:type="gramStart"/>
-      <w:r>
-        <w:t>/ ,</w:t>
-      </w:r>
-      <w:proofErr w:type="gramEnd"/>
-      <w:r>
-        <w:t>%</w:t>
-      </w:r>
-      <w:proofErr w:type="gramStart"/>
-      <w:r>
-        <w:t>],  [</w:t>
-      </w:r>
-      <w:proofErr w:type="gramEnd"/>
-      <w:r>
-        <w:t>+, -</w:t>
-      </w:r>
-      <w:proofErr w:type="gramStart"/>
-      <w:r>
-        <w:t>],  [</w:t>
-      </w:r>
-      <w:proofErr w:type="gramEnd"/>
-      <w:r>
-        <w:t>==</w:t>
-      </w:r>
-      <w:proofErr w:type="gramStart"/>
-      <w:r>
-        <w:t>, !</w:t>
-      </w:r>
-      <w:proofErr w:type="gramEnd"/>
-      <w:r>
-        <w:t>=, &gt;, &gt;=, &lt;, &lt;=</w:t>
-      </w:r>
-      <w:proofErr w:type="gramStart"/>
-      <w:r>
-        <w:t>],  [</w:t>
-      </w:r>
-      <w:proofErr w:type="gramEnd"/>
-      <w:r>
-        <w:t>not</w:t>
-      </w:r>
-      <w:proofErr w:type="gramStart"/>
-      <w:r>
-        <w:t>],  [</w:t>
-      </w:r>
-      <w:proofErr w:type="gramEnd"/>
-      <w:r>
-        <w:t>and</w:t>
-      </w:r>
-      <w:proofErr w:type="gramStart"/>
-      <w:r>
-        <w:t>],  [or]  --</w:t>
-      </w:r>
-      <w:proofErr w:type="gramEnd"/>
-      <w:r>
-        <w:t xml:space="preserve"> Same goes left to right</w:t>
+        <w:t>Operator Precedance: [()],  [**],  [*, / ,%],  [+, -],  [==, !=, &gt;, &gt;=, &lt;, &lt;=],  [not],  [and],  [or]  -- Same goes left to right</w:t>
       </w:r>
     </w:p>
     <w:p>
@@ -130,15 +42,7 @@
     </w:p>
     <w:p>
       <w:r>
-        <w:t xml:space="preserve">Conditional Statements: if, </w:t>
-      </w:r>
-      <w:proofErr w:type="spellStart"/>
-      <w:r>
-        <w:t>elif</w:t>
-      </w:r>
-      <w:proofErr w:type="spellEnd"/>
-      <w:r>
-        <w:t>, else</w:t>
+        <w:t>Conditional Statements: if, elif, else</w:t>
       </w:r>
       <w:r>
         <w:t>, Match Case</w:t>
@@ -151,361 +55,46 @@
     </w:p>
     <w:p>
       <w:r>
-        <w:t>Functions: built-int (</w:t>
-      </w:r>
-      <w:proofErr w:type="gramStart"/>
-      <w:r>
-        <w:t>print(</w:t>
-      </w:r>
-      <w:proofErr w:type="gramEnd"/>
-      <w:r>
-        <w:t xml:space="preserve">), </w:t>
-      </w:r>
-      <w:proofErr w:type="gramStart"/>
-      <w:r>
-        <w:t>input(</w:t>
-      </w:r>
-      <w:proofErr w:type="gramEnd"/>
-      <w:r>
-        <w:t xml:space="preserve">), </w:t>
-      </w:r>
-      <w:proofErr w:type="gramStart"/>
-      <w:r>
-        <w:t>type(</w:t>
-      </w:r>
-      <w:proofErr w:type="gramEnd"/>
-      <w:r>
-        <w:t xml:space="preserve">), </w:t>
-      </w:r>
-      <w:proofErr w:type="gramStart"/>
-      <w:r>
-        <w:t>range(</w:t>
-      </w:r>
-      <w:proofErr w:type="gramEnd"/>
-      <w:r>
-        <w:t>)), user defined</w:t>
-      </w:r>
-    </w:p>
-    <w:p>
-      <w:r>
-        <w:t xml:space="preserve">Lambda </w:t>
-      </w:r>
-      <w:proofErr w:type="gramStart"/>
-      <w:r>
-        <w:t>function(</w:t>
-      </w:r>
-      <w:proofErr w:type="gramEnd"/>
-      <w:r>
-        <w:t xml:space="preserve">used in High Order Functions): lambda </w:t>
-      </w:r>
-      <w:proofErr w:type="spellStart"/>
-      <w:proofErr w:type="gramStart"/>
-      <w:r>
-        <w:t>a,b</w:t>
-      </w:r>
-      <w:proofErr w:type="gramEnd"/>
-      <w:r>
-        <w:t>,c</w:t>
-      </w:r>
-      <w:proofErr w:type="spellEnd"/>
-      <w:r>
-        <w:t xml:space="preserve">: </w:t>
-      </w:r>
-      <w:proofErr w:type="spellStart"/>
-      <w:r>
-        <w:t>a+b+c</w:t>
-      </w:r>
-      <w:proofErr w:type="spellEnd"/>
+        <w:t>Functions: built-int (print(), input(), type(), range()), user defined</w:t>
+      </w:r>
+    </w:p>
+    <w:p>
+      <w:r>
+        <w:t>Lambda function(used in High Order Functions): lambda a,b,c: a+b+c</w:t>
+      </w:r>
     </w:p>
     <w:p>
       <w:r>
         <w:t>Strings: Python strings are immutable, Operations -&gt; Slicing, Formatting</w:t>
       </w:r>
       <w:r>
-        <w:t xml:space="preserve"> (“</w:t>
-      </w:r>
-      <w:proofErr w:type="gramStart"/>
-      <w:r>
-        <w:t>”.format</w:t>
-      </w:r>
-      <w:proofErr w:type="gramEnd"/>
-      <w:r>
-        <w:t>, f”” &lt;- f-strings)</w:t>
-      </w:r>
-    </w:p>
-    <w:p>
-      <w:r>
-        <w:t xml:space="preserve">Lists: Python lists are mutable. Methods = </w:t>
-      </w:r>
-      <w:proofErr w:type="spellStart"/>
-      <w:proofErr w:type="gramStart"/>
-      <w:r>
-        <w:t>l.append</w:t>
-      </w:r>
-      <w:proofErr w:type="spellEnd"/>
-      <w:proofErr w:type="gramEnd"/>
-      <w:r>
-        <w:t>(</w:t>
-      </w:r>
-      <w:proofErr w:type="spellStart"/>
-      <w:r>
-        <w:t>val</w:t>
-      </w:r>
-      <w:proofErr w:type="spellEnd"/>
-      <w:r>
-        <w:t xml:space="preserve">), </w:t>
-      </w:r>
-      <w:proofErr w:type="spellStart"/>
-      <w:proofErr w:type="gramStart"/>
-      <w:r>
-        <w:t>l.insert</w:t>
-      </w:r>
-      <w:proofErr w:type="spellEnd"/>
-      <w:proofErr w:type="gramEnd"/>
-      <w:r>
-        <w:t>(</w:t>
-      </w:r>
-      <w:proofErr w:type="spellStart"/>
-      <w:r>
-        <w:t>idx</w:t>
-      </w:r>
-      <w:proofErr w:type="spellEnd"/>
-      <w:r>
-        <w:t xml:space="preserve">, </w:t>
-      </w:r>
-      <w:proofErr w:type="spellStart"/>
-      <w:r>
-        <w:t>val</w:t>
-      </w:r>
-      <w:proofErr w:type="spellEnd"/>
-      <w:r>
-        <w:t xml:space="preserve">), </w:t>
-      </w:r>
-      <w:proofErr w:type="spellStart"/>
-      <w:proofErr w:type="gramStart"/>
-      <w:r>
-        <w:t>l.sort</w:t>
-      </w:r>
-      <w:proofErr w:type="spellEnd"/>
-      <w:proofErr w:type="gramEnd"/>
-      <w:r>
-        <w:t xml:space="preserve">(), </w:t>
-      </w:r>
-      <w:proofErr w:type="spellStart"/>
-      <w:proofErr w:type="gramStart"/>
-      <w:r>
-        <w:t>l.reverse</w:t>
-      </w:r>
-      <w:proofErr w:type="spellEnd"/>
-      <w:proofErr w:type="gramEnd"/>
-      <w:r>
-        <w:t>()</w:t>
-      </w:r>
-    </w:p>
-    <w:p>
-      <w:r>
-        <w:t xml:space="preserve">Tuples: Immutable sequence of values (Imagine as immutable lists), methods = </w:t>
-      </w:r>
-      <w:proofErr w:type="spellStart"/>
-      <w:proofErr w:type="gramStart"/>
-      <w:r>
-        <w:t>t.index</w:t>
-      </w:r>
-      <w:proofErr w:type="spellEnd"/>
-      <w:proofErr w:type="gramEnd"/>
-      <w:r>
-        <w:t>(</w:t>
-      </w:r>
-      <w:proofErr w:type="spellStart"/>
-      <w:r>
-        <w:t>val</w:t>
-      </w:r>
-      <w:proofErr w:type="spellEnd"/>
-      <w:r>
-        <w:t xml:space="preserve">), </w:t>
-      </w:r>
-      <w:proofErr w:type="spellStart"/>
-      <w:proofErr w:type="gramStart"/>
-      <w:r>
-        <w:t>t.count</w:t>
-      </w:r>
-      <w:proofErr w:type="spellEnd"/>
-      <w:proofErr w:type="gramEnd"/>
-      <w:r>
-        <w:t>(</w:t>
-      </w:r>
-      <w:proofErr w:type="spellStart"/>
-      <w:r>
-        <w:t>val</w:t>
-      </w:r>
-      <w:proofErr w:type="spellEnd"/>
-      <w:r>
-        <w:t>)</w:t>
-      </w:r>
-    </w:p>
-    <w:p>
-      <w:r>
-        <w:t xml:space="preserve">Dictionary: </w:t>
-      </w:r>
-      <w:proofErr w:type="spellStart"/>
-      <w:r>
-        <w:t>key:value</w:t>
-      </w:r>
-      <w:proofErr w:type="spellEnd"/>
-      <w:r>
-        <w:t xml:space="preserve"> pairs &amp; Python dictionaries are mutable</w:t>
+        <w:t xml:space="preserve"> (“”.format, f”” &lt;- f-strings)</w:t>
+      </w:r>
+    </w:p>
+    <w:p>
+      <w:r>
+        <w:t>Lists: Python lists are mutable. Methods = l.append(val), l.insert(idx, val), l.sort(), l.reverse()</w:t>
+      </w:r>
+    </w:p>
+    <w:p>
+      <w:r>
+        <w:t>Tuples: Immutable sequence of values (Imagine as immutable lists), methods = t.index(val), t.count(val)</w:t>
+      </w:r>
+    </w:p>
+    <w:p>
+      <w:r>
+        <w:t>Dictionary: key:value pairs &amp; Python dictionaries are mutable</w:t>
       </w:r>
       <w:r>
         <w:t>.</w:t>
       </w:r>
       <w:r>
-        <w:t xml:space="preserve"> Methods = </w:t>
-      </w:r>
-      <w:proofErr w:type="spellStart"/>
-      <w:proofErr w:type="gramStart"/>
-      <w:r>
-        <w:t>d.keys</w:t>
-      </w:r>
-      <w:proofErr w:type="spellEnd"/>
-      <w:proofErr w:type="gramEnd"/>
-      <w:r>
-        <w:t xml:space="preserve">(), </w:t>
-      </w:r>
-      <w:proofErr w:type="spellStart"/>
-      <w:proofErr w:type="gramStart"/>
-      <w:r>
-        <w:t>d.values</w:t>
-      </w:r>
-      <w:proofErr w:type="spellEnd"/>
-      <w:proofErr w:type="gramEnd"/>
-      <w:r>
-        <w:t xml:space="preserve">(), </w:t>
-      </w:r>
-      <w:proofErr w:type="spellStart"/>
-      <w:proofErr w:type="gramStart"/>
-      <w:r>
-        <w:t>d.items</w:t>
-      </w:r>
-      <w:proofErr w:type="spellEnd"/>
-      <w:proofErr w:type="gramEnd"/>
-      <w:r>
-        <w:t xml:space="preserve">(), </w:t>
-      </w:r>
-      <w:proofErr w:type="spellStart"/>
-      <w:r>
-        <w:t>d.get</w:t>
-      </w:r>
-      <w:proofErr w:type="spellEnd"/>
-      <w:r>
-        <w:t>(</w:t>
-      </w:r>
-      <w:proofErr w:type="spellStart"/>
-      <w:r>
-        <w:t>val</w:t>
-      </w:r>
-      <w:proofErr w:type="spellEnd"/>
-      <w:r>
-        <w:t xml:space="preserve">), </w:t>
-      </w:r>
-      <w:proofErr w:type="spellStart"/>
-      <w:proofErr w:type="gramStart"/>
-      <w:r>
-        <w:t>d.update</w:t>
-      </w:r>
-      <w:proofErr w:type="spellEnd"/>
-      <w:proofErr w:type="gramEnd"/>
-      <w:r>
-        <w:t>(</w:t>
-      </w:r>
-      <w:proofErr w:type="spellStart"/>
-      <w:r>
-        <w:t>new_item</w:t>
-      </w:r>
-      <w:proofErr w:type="spellEnd"/>
-      <w:r>
-        <w:t>)</w:t>
-      </w:r>
-    </w:p>
-    <w:p>
-      <w:r>
-        <w:t xml:space="preserve">Sets: Collection of unique elements. Sets can be mutable, but their elements should be immutable (Lists &amp; Dictionaries can’t be elements of a set). Methods = </w:t>
-      </w:r>
-      <w:proofErr w:type="spellStart"/>
-      <w:r>
-        <w:t>s.add</w:t>
-      </w:r>
-      <w:proofErr w:type="spellEnd"/>
-      <w:r>
-        <w:t>(</w:t>
-      </w:r>
-      <w:proofErr w:type="spellStart"/>
-      <w:r>
-        <w:t>val</w:t>
-      </w:r>
-      <w:proofErr w:type="spellEnd"/>
-      <w:r>
-        <w:t xml:space="preserve">), </w:t>
-      </w:r>
-      <w:proofErr w:type="spellStart"/>
-      <w:proofErr w:type="gramStart"/>
-      <w:r>
-        <w:t>s.remove</w:t>
-      </w:r>
-      <w:proofErr w:type="spellEnd"/>
-      <w:proofErr w:type="gramEnd"/>
-      <w:r>
-        <w:t>(</w:t>
-      </w:r>
-      <w:proofErr w:type="spellStart"/>
-      <w:r>
-        <w:t>val</w:t>
-      </w:r>
-      <w:proofErr w:type="spellEnd"/>
-      <w:r>
-        <w:t xml:space="preserve">), </w:t>
-      </w:r>
-      <w:proofErr w:type="spellStart"/>
-      <w:proofErr w:type="gramStart"/>
-      <w:r>
-        <w:t>s.clear</w:t>
-      </w:r>
-      <w:proofErr w:type="spellEnd"/>
-      <w:proofErr w:type="gramEnd"/>
-      <w:r>
-        <w:t xml:space="preserve">(), </w:t>
-      </w:r>
-      <w:proofErr w:type="spellStart"/>
-      <w:proofErr w:type="gramStart"/>
-      <w:r>
-        <w:t>s.pop</w:t>
-      </w:r>
-      <w:proofErr w:type="spellEnd"/>
-      <w:r>
-        <w:t>(</w:t>
-      </w:r>
-      <w:proofErr w:type="gramEnd"/>
-      <w:r>
-        <w:t xml:space="preserve">), </w:t>
-      </w:r>
-      <w:proofErr w:type="spellStart"/>
-      <w:proofErr w:type="gramStart"/>
-      <w:r>
-        <w:t>s.union</w:t>
-      </w:r>
-      <w:proofErr w:type="spellEnd"/>
-      <w:proofErr w:type="gramEnd"/>
-      <w:r>
-        <w:t xml:space="preserve">(set2), </w:t>
-      </w:r>
-      <w:proofErr w:type="spellStart"/>
-      <w:proofErr w:type="gramStart"/>
-      <w:r>
-        <w:t>s.intersection</w:t>
-      </w:r>
-      <w:proofErr w:type="spellEnd"/>
-      <w:proofErr w:type="gramEnd"/>
-      <w:r>
-        <w:t>(set2)</w:t>
+        <w:t xml:space="preserve"> Methods = d.keys(), d.values(), d.items(), d.get(val), d.update(new_item)</w:t>
+      </w:r>
+    </w:p>
+    <w:p>
+      <w:r>
+        <w:t>Sets: Collection of unique elements. Sets can be mutable, but their elements should be immutable (Lists &amp; Dictionaries can’t be elements of a set). Methods = s.add(val), s.remove(val), s.clear(), s.pop(), s.union(set2), s.intersection(set2)</w:t>
       </w:r>
     </w:p>
     <w:p/>
@@ -521,20 +110,7 @@
     </w:p>
     <w:p>
       <w:r>
-        <w:t xml:space="preserve">Constructor – </w:t>
-      </w:r>
-      <w:proofErr w:type="spellStart"/>
-      <w:proofErr w:type="gramStart"/>
-      <w:r>
-        <w:t>init</w:t>
-      </w:r>
-      <w:proofErr w:type="spellEnd"/>
-      <w:r>
-        <w:t>(</w:t>
-      </w:r>
-      <w:proofErr w:type="gramEnd"/>
-      <w:r>
-        <w:t>) Method: Default &amp; Parameterised. We can’t create multiple constructors in Python; otherwise, it takes the last one if all are the same, and if different, then it gives errors</w:t>
+        <w:t>Constructor – init() Method: Default &amp; Parameterised. We can’t create multiple constructors in Python; otherwise, it takes the last one if all are the same, and if different, then it gives errors</w:t>
       </w:r>
     </w:p>
     <w:p>
@@ -565,6 +141,75 @@
       </w:r>
       <w:r>
         <w:t>. Single Level Inheritance, Multi Level Inheritance, Multiple Inheritance</w:t>
+      </w:r>
+    </w:p>
+    <w:p>
+      <w:r>
+        <w:t>Abstraction: Hiding Internal details &amp; showing only essential features. Abstract classes are blue print for other classes</w:t>
+      </w:r>
+    </w:p>
+    <w:p>
+      <w:r>
+        <w:t>Polymorphisms: Many forms</w:t>
+      </w:r>
+      <w:r>
+        <w:t>. Operator Overloading &amp; Overriding. Function Overriding (inheritance) &amp; Duck Typing</w:t>
+      </w:r>
+    </w:p>
+    <w:p/>
+    <w:p>
+      <w:r>
+        <w:t>File I/O</w:t>
+      </w:r>
+    </w:p>
+    <w:p>
+      <w:r>
+        <w:t>Operations: Open, read &amp; close</w:t>
+      </w:r>
+    </w:p>
+    <w:p>
+      <w:r>
+        <w:t>F = open(“data.txt”, “r”)</w:t>
+      </w:r>
+    </w:p>
+    <w:p>
+      <w:r>
+        <w:t>r (reading [default]), w (writing, truncates file first), x (creates new &amp; open for writing), a (writing, appends at end), b (binary mode), t (text mode [default]), + (opens disk file for update(r &amp; w))</w:t>
+      </w:r>
+    </w:p>
+    <w:p>
+      <w:r>
+        <w:t>with Keyword -&gt; with open(“data.txt”, “r”) as f: print(f.read())</w:t>
+      </w:r>
+    </w:p>
+    <w:p>
+      <w:r>
+        <w:t>Delete files: os modules</w:t>
+      </w:r>
+    </w:p>
+    <w:p>
+      <w:r>
+        <w:t>Exception Handling: try, except, else, finally</w:t>
+      </w:r>
+    </w:p>
+    <w:p>
+      <w:r>
+        <w:t>List Comprehensions: [output for item in iterable if condition]</w:t>
+      </w:r>
+    </w:p>
+    <w:p>
+      <w:r>
+        <w:t>JSON Module (JavaScript Object Notation): import json. Arrays-&gt;list, object-&gt;dict, string-&gt;str, null-&gt;None</w:t>
+      </w:r>
+    </w:p>
+    <w:p>
+      <w:pPr>
+        <w:rPr>
+          <w:lang w:val="en-US"/>
+        </w:rPr>
+      </w:pPr>
+      <w:r>
+        <w:t>Json.loads(), json.dumps(), json.load(), json.dump()</w:t>
       </w:r>
     </w:p>
     <w:sectPr>

</xml_diff>

<commit_message>
Data Visualization Part 1
</commit_message>
<xml_diff>
--- a/Lectures/Notes.docx
+++ b/Lectures/Notes.docx
@@ -4945,6 +4945,404 @@
         </w:rPr>
         <w:br/>
         <w:t>Navigating DOM (Document Object Model) = parent, children, descendants, next_sibling(), previous_sibling()</w:t>
+      </w:r>
+    </w:p>
+    <w:p>
+      <w:pPr>
+        <w:rPr>
+          <w:color w:val="000000" w:themeColor="text1"/>
+        </w:rPr>
+      </w:pPr>
+    </w:p>
+    <w:p>
+      <w:pPr>
+        <w:rPr>
+          <w:b/>
+          <w:bCs/>
+          <w:color w:val="000000" w:themeColor="text1"/>
+          <w:sz w:val="28"/>
+          <w:szCs w:val="28"/>
+        </w:rPr>
+      </w:pPr>
+      <w:r>
+        <w:rPr>
+          <w:b/>
+          <w:bCs/>
+          <w:color w:val="000000" w:themeColor="text1"/>
+          <w:sz w:val="28"/>
+          <w:szCs w:val="28"/>
+        </w:rPr>
+        <w:t>DATA VISUALIZATION</w:t>
+      </w:r>
+    </w:p>
+    <w:p>
+      <w:pPr>
+        <w:rPr>
+          <w:color w:val="000000" w:themeColor="text1"/>
+        </w:rPr>
+      </w:pPr>
+      <w:r>
+        <w:rPr>
+          <w:color w:val="000000" w:themeColor="text1"/>
+        </w:rPr>
+        <w:t>E</w:t>
+      </w:r>
+      <w:r>
+        <w:rPr>
+          <w:color w:val="000000" w:themeColor="text1"/>
+        </w:rPr>
+        <w:t>DA  |  Model evaluation  |  Communicate  |  Business/research</w:t>
+      </w:r>
+    </w:p>
+    <w:p>
+      <w:pPr>
+        <w:rPr>
+          <w:color w:val="000000" w:themeColor="text1"/>
+        </w:rPr>
+      </w:pPr>
+      <w:r>
+        <w:rPr>
+          <w:color w:val="000000" w:themeColor="text1"/>
+        </w:rPr>
+        <w:t>How to Plot? Charts/plots, line plot, pie chart, histograms, scatter plots</w:t>
+      </w:r>
+    </w:p>
+    <w:p>
+      <w:pPr>
+        <w:rPr>
+          <w:color w:val="000000" w:themeColor="text1"/>
+        </w:rPr>
+      </w:pPr>
+      <w:r>
+        <w:rPr>
+          <w:b/>
+          <w:bCs/>
+          <w:color w:val="000000" w:themeColor="text1"/>
+        </w:rPr>
+        <w:t>Matplotlib</w:t>
+      </w:r>
+      <w:r>
+        <w:rPr>
+          <w:b/>
+          <w:bCs/>
+          <w:color w:val="000000" w:themeColor="text1"/>
+        </w:rPr>
+        <w:br/>
+      </w:r>
+      <w:r>
+        <w:rPr>
+          <w:color w:val="000000" w:themeColor="text1"/>
+        </w:rPr>
+        <w:t>li</w:t>
+      </w:r>
+      <w:r>
+        <w:rPr>
+          <w:color w:val="000000" w:themeColor="text1"/>
+        </w:rPr>
+        <w:t>brary for creating static, animated &amp; interactive visualizations</w:t>
+      </w:r>
+      <w:r>
+        <w:rPr>
+          <w:color w:val="000000" w:themeColor="text1"/>
+        </w:rPr>
+        <w:br/>
+        <w:t xml:space="preserve">                         </w:t>
+      </w:r>
+      <w:r>
+        <w:rPr>
+          <w:b/>
+          <w:bCs/>
+          <w:color w:val="FF00FF"/>
+        </w:rPr>
+        <w:t>import</w:t>
+      </w:r>
+      <w:r>
+        <w:rPr>
+          <w:color w:val="000000" w:themeColor="text1"/>
+        </w:rPr>
+        <w:t xml:space="preserve"> matplotlib.pyplot </w:t>
+      </w:r>
+      <w:r>
+        <w:rPr>
+          <w:b/>
+          <w:bCs/>
+          <w:color w:val="00B050"/>
+        </w:rPr>
+        <w:t>as</w:t>
+      </w:r>
+      <w:r>
+        <w:rPr>
+          <w:color w:val="00B050"/>
+        </w:rPr>
+        <w:t xml:space="preserve"> </w:t>
+      </w:r>
+      <w:r>
+        <w:rPr>
+          <w:color w:val="000000" w:themeColor="text1"/>
+        </w:rPr>
+        <w:t>plt</w:t>
+      </w:r>
+      <w:r>
+        <w:rPr>
+          <w:color w:val="000000" w:themeColor="text1"/>
+        </w:rPr>
+        <w:br/>
+        <w:t>title(), xlabel(), ylabel(), legend()</w:t>
+      </w:r>
+      <w:r>
+        <w:rPr>
+          <w:color w:val="000000" w:themeColor="text1"/>
+        </w:rPr>
+        <w:br/>
+      </w:r>
+      <w:r>
+        <w:rPr>
+          <w:b/>
+          <w:bCs/>
+          <w:color w:val="000000" w:themeColor="text1"/>
+        </w:rPr>
+        <w:t>Format Strings</w:t>
+      </w:r>
+      <w:r>
+        <w:rPr>
+          <w:color w:val="000000" w:themeColor="text1"/>
+        </w:rPr>
+        <w:t xml:space="preserve"> – A format string consists of a part for color, marker and line:</w:t>
+      </w:r>
+      <w:r>
+        <w:rPr>
+          <w:color w:val="000000" w:themeColor="text1"/>
+        </w:rPr>
+        <w:br/>
+        <w:t xml:space="preserve">                            fmt = ‘[marker][line][color]’</w:t>
+      </w:r>
+      <w:r>
+        <w:rPr>
+          <w:color w:val="000000" w:themeColor="text1"/>
+        </w:rPr>
+        <w:br/>
+        <w:t xml:space="preserve">    color, marker, linestyle, line width</w:t>
+      </w:r>
+      <w:r>
+        <w:rPr>
+          <w:color w:val="000000" w:themeColor="text1"/>
+        </w:rPr>
+        <w:br/>
+      </w:r>
+      <w:r>
+        <w:rPr>
+          <w:color w:val="000000" w:themeColor="text1"/>
+        </w:rPr>
+        <w:br/>
+        <w:t xml:space="preserve">Other </w:t>
+      </w:r>
+      <w:r>
+        <w:rPr>
+          <w:b/>
+          <w:bCs/>
+          <w:color w:val="000000" w:themeColor="text1"/>
+        </w:rPr>
+        <w:t>Methods</w:t>
+      </w:r>
+      <w:r>
+        <w:rPr>
+          <w:color w:val="000000" w:themeColor="text1"/>
+        </w:rPr>
+        <w:t xml:space="preserve"> &amp; </w:t>
+      </w:r>
+      <w:r>
+        <w:rPr>
+          <w:b/>
+          <w:bCs/>
+          <w:color w:val="000000" w:themeColor="text1"/>
+        </w:rPr>
+        <w:t>Attributes</w:t>
+      </w:r>
+      <w:r>
+        <w:rPr>
+          <w:color w:val="000000" w:themeColor="text1"/>
+        </w:rPr>
+        <w:t>:</w:t>
+      </w:r>
+      <w:r>
+        <w:rPr>
+          <w:color w:val="000000" w:themeColor="text1"/>
+        </w:rPr>
+        <w:br/>
+        <w:t xml:space="preserve">    style.available, style.user(), grid(), tight_layout(), savefig(“abc.png”)</w:t>
+      </w:r>
+    </w:p>
+    <w:p>
+      <w:pPr>
+        <w:rPr>
+          <w:color w:val="000000" w:themeColor="text1"/>
+        </w:rPr>
+      </w:pPr>
+      <w:r>
+        <w:rPr>
+          <w:b/>
+          <w:bCs/>
+          <w:color w:val="000000" w:themeColor="text1"/>
+        </w:rPr>
+        <w:t>Plot Methods</w:t>
+      </w:r>
+      <w:r>
+        <w:rPr>
+          <w:color w:val="000000" w:themeColor="text1"/>
+        </w:rPr>
+        <w:t>:</w:t>
+      </w:r>
+      <w:r>
+        <w:rPr>
+          <w:color w:val="000000" w:themeColor="text1"/>
+        </w:rPr>
+        <w:br/>
+        <w:t xml:space="preserve">  1. plt.plot(x, y) – Line plot</w:t>
+      </w:r>
+      <w:r>
+        <w:rPr>
+          <w:color w:val="000000" w:themeColor="text1"/>
+        </w:rPr>
+        <w:br/>
+        <w:t xml:space="preserve">  2. plt.bar(x, height) – Vertical bar chart</w:t>
+      </w:r>
+      <w:r>
+        <w:rPr>
+          <w:color w:val="000000" w:themeColor="text1"/>
+        </w:rPr>
+        <w:br/>
+        <w:t xml:space="preserve">  3. plt.barh(y, width) – Horizontal bar chart</w:t>
+      </w:r>
+      <w:r>
+        <w:rPr>
+          <w:color w:val="000000" w:themeColor="text1"/>
+        </w:rPr>
+        <w:br/>
+        <w:t xml:space="preserve">  4. plt.scatter(x,y) – Scatter plot</w:t>
+      </w:r>
+      <w:r>
+        <w:rPr>
+          <w:color w:val="000000" w:themeColor="text1"/>
+        </w:rPr>
+        <w:br/>
+        <w:t xml:space="preserve">  5. plt.pie(data) – Pie chart</w:t>
+      </w:r>
+      <w:r>
+        <w:rPr>
+          <w:color w:val="000000" w:themeColor="text1"/>
+        </w:rPr>
+        <w:br/>
+        <w:t xml:space="preserve">  6. plt.hist(data, bins) – Histogram</w:t>
+      </w:r>
+      <w:r>
+        <w:rPr>
+          <w:color w:val="000000" w:themeColor="text1"/>
+        </w:rPr>
+        <w:br/>
+        <w:t xml:space="preserve">  7. plt.boxplot(data) – Box plot</w:t>
+      </w:r>
+    </w:p>
+    <w:p>
+      <w:pPr>
+        <w:rPr>
+          <w:color w:val="000000" w:themeColor="text1"/>
+        </w:rPr>
+      </w:pPr>
+      <w:r>
+        <w:rPr>
+          <w:b/>
+          <w:bCs/>
+          <w:color w:val="000000" w:themeColor="text1"/>
+        </w:rPr>
+        <w:t>Bar Charts</w:t>
+      </w:r>
+      <w:r>
+        <w:rPr>
+          <w:color w:val="000000" w:themeColor="text1"/>
+        </w:rPr>
+        <w:t>:</w:t>
+      </w:r>
+      <w:r>
+        <w:rPr>
+          <w:color w:val="000000" w:themeColor="text1"/>
+        </w:rPr>
+        <w:t xml:space="preserve"> </w:t>
+      </w:r>
+      <w:r>
+        <w:rPr>
+          <w:color w:val="000000" w:themeColor="text1"/>
+        </w:rPr>
+        <w:t>A bar plot (or bar chart) is a graph that displays categorical data using rectangular bars.</w:t>
+      </w:r>
+      <w:r>
+        <w:rPr>
+          <w:color w:val="000000" w:themeColor="text1"/>
+        </w:rPr>
+        <w:br/>
+        <w:t>Each bar’s height (or length, in horizontal bars) represents a value.</w:t>
+      </w:r>
+    </w:p>
+    <w:p>
+      <w:pPr>
+        <w:rPr>
+          <w:color w:val="000000" w:themeColor="text1"/>
+        </w:rPr>
+      </w:pPr>
+      <w:r>
+        <w:rPr>
+          <w:b/>
+          <w:bCs/>
+          <w:color w:val="000000" w:themeColor="text1"/>
+        </w:rPr>
+        <w:t>Scatter Plots</w:t>
+      </w:r>
+      <w:r>
+        <w:rPr>
+          <w:color w:val="000000" w:themeColor="text1"/>
+        </w:rPr>
+        <w:t>: A scatter plot shows the relationship between two variables by plotting points on a 2D plane.</w:t>
+      </w:r>
+      <w:r>
+        <w:rPr>
+          <w:color w:val="000000" w:themeColor="text1"/>
+        </w:rPr>
+        <w:t xml:space="preserve"> [Customizations = Color, Size, Marker, Transparency, Colormap]</w:t>
+      </w:r>
+      <w:r>
+        <w:rPr>
+          <w:color w:val="000000" w:themeColor="text1"/>
+        </w:rPr>
+        <w:br/>
+        <w:t>Annotations = plt.annotate(“text”, xy=(x_point, y_point), xytext(x_text, y_text))</w:t>
+      </w:r>
+    </w:p>
+    <w:p>
+      <w:pPr>
+        <w:rPr>
+          <w:b/>
+          <w:bCs/>
+          <w:color w:val="000000" w:themeColor="text1"/>
+        </w:rPr>
+      </w:pPr>
+      <w:r>
+        <w:rPr>
+          <w:color w:val="000000" w:themeColor="text1"/>
+        </w:rPr>
+        <w:t>Pie Charts: A pie chart is a circular chart divided into slices to show relative proportions of a whole.</w:t>
+      </w:r>
+      <w:r>
+        <w:rPr>
+          <w:color w:val="000000" w:themeColor="text1"/>
+        </w:rPr>
+        <w:br/>
+        <w:t xml:space="preserve">     Each slice = a category &amp; Size of slice = value of that category relative to total</w:t>
+      </w:r>
+      <w:r>
+        <w:rPr>
+          <w:color w:val="000000" w:themeColor="text1"/>
+        </w:rPr>
+        <w:br/>
+        <w:t>Customizations = autopct, colors, Wedgeprops, explode, startangle, shadow</w:t>
       </w:r>
     </w:p>
     <w:sectPr>

</xml_diff>